<commit_message>
Test for blank field added
git-svn-id: http://linuxic/jsrc/af/trunk@48988 f0974e12-e15a-48e7-82bd-60f10596da88
</commit_message>
<xml_diff>
--- a/af-back/src/test/resources/pdf/DemandeAccepteeTest.docx
+++ b/af-back/src/test/resources/pdf/DemandeAccepteeTest.docx
@@ -1015,6 +1015,8 @@
         </w:rPr>
         <w:t>qui n’appelle aucune objection de ma part.</w:t>
       </w:r>
+      <w:bookmarkStart w:id="0" w:name="_GoBack"/>
+      <w:bookmarkEnd w:id="0"/>
     </w:p>
     <w:p>
       <w:pPr>
@@ -1029,6 +1031,61 @@
           <w:szCs w:val="24"/>
         </w:rPr>
       </w:pPr>
+      <w:r>
+        <w:rPr>
+          <w:bCs/>
+          <w:sz w:val="24"/>
+          <w:szCs w:val="24"/>
+        </w:rPr>
+        <w:fldChar w:fldCharType="begin"/>
+      </w:r>
+      <w:r>
+        <w:rPr>
+          <w:bCs/>
+          <w:sz w:val="24"/>
+          <w:szCs w:val="24"/>
+        </w:rPr>
+        <w:instrText xml:space="preserve"> MERGEFIELD  #if($StringUtils.isNotBlank($commentaire))  \* MERGEFORMAT </w:instrText>
+      </w:r>
+      <w:r>
+        <w:rPr>
+          <w:bCs/>
+          <w:sz w:val="24"/>
+          <w:szCs w:val="24"/>
+        </w:rPr>
+        <w:fldChar w:fldCharType="separate"/>
+      </w:r>
+      <w:r>
+        <w:rPr>
+          <w:bCs/>
+          <w:noProof/>
+          <w:sz w:val="24"/>
+          <w:szCs w:val="24"/>
+        </w:rPr>
+        <w:t>«#if($StringUtils.isNotBlank($commentaire»</w:t>
+      </w:r>
+      <w:r>
+        <w:rPr>
+          <w:bCs/>
+          <w:sz w:val="24"/>
+          <w:szCs w:val="24"/>
+        </w:rPr>
+        <w:fldChar w:fldCharType="end"/>
+      </w:r>
+    </w:p>
+    <w:p>
+      <w:pPr>
+        <w:tabs>
+          <w:tab w:val="left" w:pos="1764"/>
+        </w:tabs>
+        <w:ind w:right="1134"/>
+        <w:jc w:val="both"/>
+        <w:rPr>
+          <w:bCs/>
+          <w:sz w:val="24"/>
+          <w:szCs w:val="24"/>
+        </w:rPr>
+      </w:pPr>
     </w:p>
     <w:p>
       <w:pPr>
@@ -1057,7 +1114,7 @@
           <w:sz w:val="24"/>
           <w:szCs w:val="24"/>
         </w:rPr>
-        <w:instrText xml:space="preserve"> MERGEFIELD  #if($StringUtils.isNotBlank($commentaire))  \* MERGEFORMAT </w:instrText>
+        <w:instrText xml:space="preserve"> MERGEFIELD  $commentaire  \* MERGEFORMAT </w:instrText>
       </w:r>
       <w:r>
         <w:rPr>
@@ -1074,7 +1131,7 @@
           <w:sz w:val="24"/>
           <w:szCs w:val="24"/>
         </w:rPr>
-        <w:t>«#if($StringUtils.isNotBlank($commentaire»</w:t>
+        <w:t>«$commentaire»</w:t>
       </w:r>
       <w:r>
         <w:rPr>
@@ -1084,33 +1141,6 @@
         </w:rPr>
         <w:fldChar w:fldCharType="end"/>
       </w:r>
-    </w:p>
-    <w:p>
-      <w:pPr>
-        <w:tabs>
-          <w:tab w:val="left" w:pos="1764"/>
-        </w:tabs>
-        <w:ind w:left="1418" w:right="1134"/>
-        <w:jc w:val="both"/>
-        <w:rPr>
-          <w:bCs/>
-          <w:sz w:val="24"/>
-          <w:szCs w:val="24"/>
-        </w:rPr>
-      </w:pPr>
-    </w:p>
-    <w:p>
-      <w:pPr>
-        <w:tabs>
-          <w:tab w:val="left" w:pos="1764"/>
-        </w:tabs>
-        <w:ind w:left="1418" w:right="1134"/>
-        <w:jc w:val="both"/>
-        <w:rPr>
-          <w:sz w:val="24"/>
-          <w:szCs w:val="24"/>
-        </w:rPr>
-      </w:pPr>
       <w:r>
         <w:rPr>
           <w:bCs/>
@@ -1125,7 +1155,7 @@
           <w:sz w:val="24"/>
           <w:szCs w:val="24"/>
         </w:rPr>
-        <w:instrText xml:space="preserve"> MERGEFIELD  $commentaire  \* MERGEFORMAT </w:instrText>
+        <w:instrText xml:space="preserve"> MERGEFIELD  #end  \* MERGEFORMAT </w:instrText>
       </w:r>
       <w:r>
         <w:rPr>
@@ -1142,7 +1172,7 @@
           <w:sz w:val="24"/>
           <w:szCs w:val="24"/>
         </w:rPr>
-        <w:t>«$commentaire»</w:t>
+        <w:t>«#end»</w:t>
       </w:r>
       <w:r>
         <w:rPr>
@@ -1152,63 +1182,157 @@
         </w:rPr>
         <w:fldChar w:fldCharType="end"/>
       </w:r>
-      <w:r>
-        <w:rPr>
-          <w:bCs/>
-          <w:sz w:val="24"/>
-          <w:szCs w:val="24"/>
-        </w:rPr>
+    </w:p>
+    <w:p>
+      <w:pPr>
+        <w:pStyle w:val="Retraitcorpsdetexte2"/>
+        <w:tabs>
+          <w:tab w:val="left" w:pos="1764"/>
+          <w:tab w:val="left" w:pos="2268"/>
+        </w:tabs>
+        <w:ind w:left="1418" w:right="1134" w:firstLine="0"/>
+        <w:rPr>
+          <w:rFonts w:ascii="Times New Roman" w:hAnsi="Times New Roman"/>
+        </w:rPr>
+      </w:pPr>
+    </w:p>
+    <w:p>
+      <w:pPr>
+        <w:pStyle w:val="Normalcentr"/>
+        <w:tabs>
+          <w:tab w:val="left" w:pos="1764"/>
+        </w:tabs>
+        <w:ind w:left="1418" w:firstLine="0"/>
+      </w:pPr>
+      <w:r>
+        <w:t>Je</w:t>
+      </w:r>
+      <w:r>
+        <w:t xml:space="preserve"> vous prie d’agréer, </w:t>
+      </w:r>
+      <w:r>
+        <w:t>Messieurs,</w:t>
+      </w:r>
+      <w:r>
+        <w:t xml:space="preserve"> l’expression de mes salutations distinguées.</w:t>
+      </w:r>
+    </w:p>
+    <w:p>
+      <w:pPr>
+        <w:pStyle w:val="Normalcentr"/>
+        <w:tabs>
+          <w:tab w:val="left" w:pos="1764"/>
+        </w:tabs>
+        <w:ind w:left="1418" w:firstLine="0"/>
+      </w:pPr>
+      <w:r>
+        <w:t>_</w:t>
+      </w:r>
+      <w:r>
+        <w:t>R</w:t>
+      </w:r>
+      <w:r>
+        <w:t>APPELLE</w:t>
+      </w:r>
+      <w:r>
+        <w:t>_</w:t>
+      </w:r>
+    </w:p>
+    <w:p>
+      <w:pPr>
+        <w:pStyle w:val="Normalcentr"/>
+        <w:tabs>
+          <w:tab w:val="left" w:pos="1764"/>
+        </w:tabs>
+        <w:ind w:left="1418" w:firstLine="0"/>
+      </w:pPr>
+      <w:r>
         <w:fldChar w:fldCharType="begin"/>
       </w:r>
       <w:r>
-        <w:rPr>
-          <w:bCs/>
-          <w:sz w:val="24"/>
-          <w:szCs w:val="24"/>
-        </w:rPr>
+        <w:instrText xml:space="preserve"> MERGEFIELD  #if($StringUtils.isNotBlank($psMessage))  \* MERGEFORMAT </w:instrText>
+      </w:r>
+      <w:r>
+        <w:fldChar w:fldCharType="separate"/>
+      </w:r>
+      <w:r>
+        <w:rPr>
+          <w:noProof/>
+        </w:rPr>
+        <w:t>«#if($StringUtils.isNotBlank($psMessage))»</w:t>
+      </w:r>
+      <w:r>
+        <w:rPr>
+          <w:noProof/>
+        </w:rPr>
+        <w:fldChar w:fldCharType="end"/>
+      </w:r>
+    </w:p>
+    <w:p>
+      <w:pPr>
+        <w:pStyle w:val="Normalcentr"/>
+        <w:tabs>
+          <w:tab w:val="left" w:pos="1764"/>
+        </w:tabs>
+        <w:ind w:left="1418" w:firstLine="0"/>
+      </w:pPr>
+    </w:p>
+    <w:p>
+      <w:pPr>
+        <w:pStyle w:val="Normalcentr"/>
+        <w:tabs>
+          <w:tab w:val="left" w:pos="1764"/>
+        </w:tabs>
+        <w:ind w:left="1418" w:firstLine="0"/>
+        <w:rPr>
+          <w:noProof/>
+        </w:rPr>
+      </w:pPr>
+      <w:r>
+        <w:fldChar w:fldCharType="begin"/>
+      </w:r>
+      <w:r>
+        <w:instrText xml:space="preserve"> MERGEFIELD  $psMessage  \* MERGEFORMAT </w:instrText>
+      </w:r>
+      <w:r>
+        <w:fldChar w:fldCharType="separate"/>
+      </w:r>
+      <w:r>
+        <w:rPr>
+          <w:noProof/>
+        </w:rPr>
+        <w:t>«$psMessage»</w:t>
+      </w:r>
+      <w:r>
+        <w:rPr>
+          <w:noProof/>
+        </w:rPr>
+        <w:fldChar w:fldCharType="end"/>
+      </w:r>
+      <w:r>
+        <w:fldChar w:fldCharType="begin"/>
+      </w:r>
+      <w:r>
         <w:instrText xml:space="preserve"> MERGEFIELD  #end  \* MERGEFORMAT </w:instrText>
       </w:r>
       <w:r>
-        <w:rPr>
-          <w:bCs/>
-          <w:sz w:val="24"/>
-          <w:szCs w:val="24"/>
-        </w:rPr>
         <w:fldChar w:fldCharType="separate"/>
       </w:r>
       <w:r>
         <w:rPr>
-          <w:bCs/>
           <w:noProof/>
-          <w:sz w:val="24"/>
-          <w:szCs w:val="24"/>
         </w:rPr>
         <w:t>«#end»</w:t>
       </w:r>
       <w:r>
         <w:rPr>
-          <w:bCs/>
-          <w:sz w:val="24"/>
-          <w:szCs w:val="24"/>
+          <w:noProof/>
         </w:rPr>
         <w:fldChar w:fldCharType="end"/>
       </w:r>
     </w:p>
     <w:p>
       <w:pPr>
-        <w:pStyle w:val="Retraitcorpsdetexte2"/>
-        <w:tabs>
-          <w:tab w:val="left" w:pos="1764"/>
-          <w:tab w:val="left" w:pos="2268"/>
-        </w:tabs>
-        <w:ind w:left="1418" w:right="1134" w:firstLine="0"/>
-        <w:rPr>
-          <w:rFonts w:ascii="Times New Roman" w:hAnsi="Times New Roman"/>
-        </w:rPr>
-      </w:pPr>
-    </w:p>
-    <w:p>
-      <w:pPr>
         <w:pStyle w:val="Normalcentr"/>
         <w:tabs>
           <w:tab w:val="left" w:pos="1764"/>
@@ -1216,93 +1340,7 @@
         <w:ind w:left="1418" w:firstLine="0"/>
       </w:pPr>
       <w:r>
-        <w:t>Je</w:t>
-      </w:r>
-      <w:r>
-        <w:t xml:space="preserve"> vous prie d’agréer, </w:t>
-      </w:r>
-      <w:r>
-        <w:t>Messieurs,</w:t>
-      </w:r>
-      <w:r>
-        <w:t xml:space="preserve"> l’expression de mes salutations distinguées.</w:t>
-      </w:r>
-    </w:p>
-    <w:p>
-      <w:pPr>
-        <w:pStyle w:val="Normalcentr"/>
-        <w:tabs>
-          <w:tab w:val="left" w:pos="1764"/>
-        </w:tabs>
-        <w:ind w:left="1418" w:firstLine="0"/>
-      </w:pPr>
-      <w:r>
-        <w:t xml:space="preserve">Rappelle: </w:t>
-      </w:r>
-    </w:p>
-    <w:p>
-      <w:pPr>
-        <w:pStyle w:val="Normalcentr"/>
-        <w:tabs>
-          <w:tab w:val="left" w:pos="1764"/>
-        </w:tabs>
-        <w:ind w:left="1418" w:firstLine="0"/>
-      </w:pPr>
-      <w:fldSimple w:instr=" MERGEFIELD  #if($StringUtils.isNotBlank($psMessage))  \* MERGEFORMAT ">
-        <w:r>
-          <w:rPr>
-            <w:noProof/>
-          </w:rPr>
-          <w:t>«#if($StringUtils.isNotBlank($psMessage))»</w:t>
-        </w:r>
-      </w:fldSimple>
-    </w:p>
-    <w:p>
-      <w:pPr>
-        <w:pStyle w:val="Normalcentr"/>
-        <w:tabs>
-          <w:tab w:val="left" w:pos="1764"/>
-        </w:tabs>
-        <w:ind w:left="1418" w:firstLine="0"/>
-      </w:pPr>
-    </w:p>
-    <w:p>
-      <w:pPr>
-        <w:pStyle w:val="Normalcentr"/>
-        <w:tabs>
-          <w:tab w:val="left" w:pos="1764"/>
-        </w:tabs>
-        <w:ind w:left="1418" w:firstLine="0"/>
-      </w:pPr>
-      <w:fldSimple w:instr=" MERGEFIELD  $psMessage  \* MERGEFORMAT ">
-        <w:r>
-          <w:rPr>
-            <w:noProof/>
-          </w:rPr>
-          <w:t>«$psMessage»</w:t>
-        </w:r>
-      </w:fldSimple>
-      <w:fldSimple w:instr=" MERGEFIELD  #end  \* MERGEFORMAT ">
-        <w:r>
-          <w:rPr>
-            <w:noProof/>
-          </w:rPr>
-          <w:t>«#end»</w:t>
-        </w:r>
-      </w:fldSimple>
-    </w:p>
-    <w:p>
-      <w:pPr>
-        <w:pStyle w:val="Normalcentr"/>
-        <w:tabs>
-          <w:tab w:val="left" w:pos="1764"/>
-        </w:tabs>
-        <w:ind w:left="1418" w:firstLine="0"/>
-      </w:pPr>
-      <w:bookmarkStart w:id="0" w:name="_GoBack"/>
-      <w:bookmarkEnd w:id="0"/>
-      <w:r>
-        <w:t>FIN_RAPPELLE.</w:t>
+        <w:t>_FIN_RAPPELLE_</w:t>
       </w:r>
     </w:p>
     <w:p>
@@ -2634,7 +2672,7 @@
 </file>
 
 <file path=customXml/itemProps1.xml><?xml version="1.0" encoding="utf-8"?>
-<ds:datastoreItem xmlns:ds="http://schemas.openxmlformats.org/officeDocument/2006/customXml" ds:itemID="{BC5990CC-5799-485A-8BE9-9B6C4C5C7B75}">
+<ds:datastoreItem xmlns:ds="http://schemas.openxmlformats.org/officeDocument/2006/customXml" ds:itemID="{0EC46595-C92E-4D6B-8565-A5F5FE33E50E}">
   <ds:schemaRefs>
     <ds:schemaRef ds:uri="http://schemas.openxmlformats.org/officeDocument/2006/bibliography"/>
   </ds:schemaRefs>

</xml_diff>

<commit_message>
refs #12406 - Tests unitaires de PdfGenerationService (af-back)
git-svn-id: http://linuxic/jsrc/af/trunk@49026 f0974e12-e15a-48e7-82bd-60f10596da88
</commit_message>
<xml_diff>
--- a/af-back/src/test/resources/pdf/DemandeAccepteeTest.docx
+++ b/af-back/src/test/resources/pdf/DemandeAccepteeTest.docx
@@ -78,7 +78,7 @@
           <w:sz w:val="24"/>
           <w:szCs w:val="24"/>
         </w:rPr>
-        <w:instrText xml:space="preserve"> MERGEFIELD  $raisonSocial  \* MERGEFORMAT </w:instrText>
+        <w:instrText xml:space="preserve"> MERGEFIELD  $raisonSociale  \* MERGEFORMAT </w:instrText>
       </w:r>
       <w:r>
         <w:rPr>
@@ -93,7 +93,7 @@
           <w:sz w:val="24"/>
           <w:szCs w:val="24"/>
         </w:rPr>
-        <w:t>«$raisonSocial»</w:t>
+        <w:t>«$raisonSociale»</w:t>
       </w:r>
       <w:r>
         <w:rPr>
@@ -1015,228 +1015,228 @@
         </w:rPr>
         <w:t>qui n’appelle aucune objection de ma part.</w:t>
       </w:r>
+    </w:p>
+    <w:p>
+      <w:pPr>
+        <w:tabs>
+          <w:tab w:val="left" w:pos="1764"/>
+        </w:tabs>
+        <w:ind w:left="1418" w:right="1134"/>
+        <w:jc w:val="both"/>
+        <w:rPr>
+          <w:bCs/>
+          <w:sz w:val="24"/>
+          <w:szCs w:val="24"/>
+        </w:rPr>
+      </w:pPr>
+      <w:r>
+        <w:rPr>
+          <w:bCs/>
+          <w:sz w:val="24"/>
+          <w:szCs w:val="24"/>
+        </w:rPr>
+        <w:fldChar w:fldCharType="begin"/>
+      </w:r>
+      <w:r>
+        <w:rPr>
+          <w:bCs/>
+          <w:sz w:val="24"/>
+          <w:szCs w:val="24"/>
+        </w:rPr>
+        <w:instrText xml:space="preserve"> MERGEFIELD  #if($StringUtils.isNotBlank($commentaire))  \* MERGEFORMAT </w:instrText>
+      </w:r>
+      <w:r>
+        <w:rPr>
+          <w:bCs/>
+          <w:sz w:val="24"/>
+          <w:szCs w:val="24"/>
+        </w:rPr>
+        <w:fldChar w:fldCharType="separate"/>
+      </w:r>
+      <w:r>
+        <w:rPr>
+          <w:bCs/>
+          <w:noProof/>
+          <w:sz w:val="24"/>
+          <w:szCs w:val="24"/>
+        </w:rPr>
+        <w:t>«#if($StringUtils.isNotBlank($commentaire»</w:t>
+      </w:r>
+      <w:r>
+        <w:rPr>
+          <w:bCs/>
+          <w:sz w:val="24"/>
+          <w:szCs w:val="24"/>
+        </w:rPr>
+        <w:fldChar w:fldCharType="end"/>
+      </w:r>
+    </w:p>
+    <w:p>
+      <w:pPr>
+        <w:tabs>
+          <w:tab w:val="left" w:pos="1764"/>
+        </w:tabs>
+        <w:ind w:right="1134"/>
+        <w:jc w:val="both"/>
+        <w:rPr>
+          <w:bCs/>
+          <w:sz w:val="24"/>
+          <w:szCs w:val="24"/>
+        </w:rPr>
+      </w:pPr>
+    </w:p>
+    <w:p>
+      <w:pPr>
+        <w:tabs>
+          <w:tab w:val="left" w:pos="1764"/>
+        </w:tabs>
+        <w:ind w:left="1418" w:right="1134"/>
+        <w:jc w:val="both"/>
+        <w:rPr>
+          <w:bCs/>
+          <w:sz w:val="24"/>
+          <w:szCs w:val="24"/>
+        </w:rPr>
+      </w:pPr>
+      <w:r>
+        <w:rPr>
+          <w:bCs/>
+          <w:sz w:val="24"/>
+          <w:szCs w:val="24"/>
+        </w:rPr>
+        <w:fldChar w:fldCharType="begin"/>
+      </w:r>
+      <w:r>
+        <w:rPr>
+          <w:bCs/>
+          <w:sz w:val="24"/>
+          <w:szCs w:val="24"/>
+        </w:rPr>
+        <w:instrText xml:space="preserve"> MERGEFIELD  $commentaire  \* MERGEFORMAT </w:instrText>
+      </w:r>
+      <w:r>
+        <w:rPr>
+          <w:bCs/>
+          <w:sz w:val="24"/>
+          <w:szCs w:val="24"/>
+        </w:rPr>
+        <w:fldChar w:fldCharType="separate"/>
+      </w:r>
+      <w:r>
+        <w:rPr>
+          <w:bCs/>
+          <w:noProof/>
+          <w:sz w:val="24"/>
+          <w:szCs w:val="24"/>
+        </w:rPr>
+        <w:t>«$commentaire»</w:t>
+      </w:r>
+      <w:r>
+        <w:rPr>
+          <w:bCs/>
+          <w:sz w:val="24"/>
+          <w:szCs w:val="24"/>
+        </w:rPr>
+        <w:fldChar w:fldCharType="end"/>
+      </w:r>
+      <w:r>
+        <w:rPr>
+          <w:bCs/>
+          <w:sz w:val="24"/>
+          <w:szCs w:val="24"/>
+        </w:rPr>
+        <w:fldChar w:fldCharType="begin"/>
+      </w:r>
+      <w:r>
+        <w:rPr>
+          <w:bCs/>
+          <w:sz w:val="24"/>
+          <w:szCs w:val="24"/>
+        </w:rPr>
+        <w:instrText xml:space="preserve"> MERGEFIELD  #end  \* MERGEFORMAT </w:instrText>
+      </w:r>
+      <w:r>
+        <w:rPr>
+          <w:bCs/>
+          <w:sz w:val="24"/>
+          <w:szCs w:val="24"/>
+        </w:rPr>
+        <w:fldChar w:fldCharType="separate"/>
+      </w:r>
+      <w:r>
+        <w:rPr>
+          <w:bCs/>
+          <w:noProof/>
+          <w:sz w:val="24"/>
+          <w:szCs w:val="24"/>
+        </w:rPr>
+        <w:t>«#end»</w:t>
+      </w:r>
+      <w:r>
+        <w:rPr>
+          <w:bCs/>
+          <w:sz w:val="24"/>
+          <w:szCs w:val="24"/>
+        </w:rPr>
+        <w:fldChar w:fldCharType="end"/>
+      </w:r>
+    </w:p>
+    <w:p>
+      <w:pPr>
+        <w:pStyle w:val="Retraitcorpsdetexte2"/>
+        <w:tabs>
+          <w:tab w:val="left" w:pos="1764"/>
+          <w:tab w:val="left" w:pos="2268"/>
+        </w:tabs>
+        <w:ind w:left="1418" w:right="1134" w:firstLine="0"/>
+        <w:rPr>
+          <w:rFonts w:ascii="Times New Roman" w:hAnsi="Times New Roman"/>
+        </w:rPr>
+      </w:pPr>
+    </w:p>
+    <w:p>
+      <w:pPr>
+        <w:pStyle w:val="Normalcentr"/>
+        <w:tabs>
+          <w:tab w:val="left" w:pos="1764"/>
+        </w:tabs>
+        <w:ind w:left="1418" w:firstLine="0"/>
+      </w:pPr>
+      <w:r>
+        <w:t>Je</w:t>
+      </w:r>
+      <w:r>
+        <w:t xml:space="preserve"> vous prie d’agréer, </w:t>
+      </w:r>
+      <w:r>
+        <w:t>Messieurs,</w:t>
+      </w:r>
+      <w:r>
+        <w:t xml:space="preserve"> l’expression de mes salutations distinguées.</w:t>
+      </w:r>
+    </w:p>
+    <w:p>
+      <w:pPr>
+        <w:pStyle w:val="Normalcentr"/>
+        <w:tabs>
+          <w:tab w:val="left" w:pos="1764"/>
+        </w:tabs>
+        <w:ind w:left="1418" w:firstLine="0"/>
+      </w:pPr>
+      <w:r>
+        <w:t>_</w:t>
+      </w:r>
+      <w:r>
+        <w:t>R</w:t>
+      </w:r>
+      <w:r>
+        <w:t>APPELLE</w:t>
+      </w:r>
+      <w:r>
+        <w:t>_</w:t>
+      </w:r>
       <w:bookmarkStart w:id="0" w:name="_GoBack"/>
       <w:bookmarkEnd w:id="0"/>
-    </w:p>
-    <w:p>
-      <w:pPr>
-        <w:tabs>
-          <w:tab w:val="left" w:pos="1764"/>
-        </w:tabs>
-        <w:ind w:left="1418" w:right="1134"/>
-        <w:jc w:val="both"/>
-        <w:rPr>
-          <w:bCs/>
-          <w:sz w:val="24"/>
-          <w:szCs w:val="24"/>
-        </w:rPr>
-      </w:pPr>
-      <w:r>
-        <w:rPr>
-          <w:bCs/>
-          <w:sz w:val="24"/>
-          <w:szCs w:val="24"/>
-        </w:rPr>
-        <w:fldChar w:fldCharType="begin"/>
-      </w:r>
-      <w:r>
-        <w:rPr>
-          <w:bCs/>
-          <w:sz w:val="24"/>
-          <w:szCs w:val="24"/>
-        </w:rPr>
-        <w:instrText xml:space="preserve"> MERGEFIELD  #if($StringUtils.isNotBlank($commentaire))  \* MERGEFORMAT </w:instrText>
-      </w:r>
-      <w:r>
-        <w:rPr>
-          <w:bCs/>
-          <w:sz w:val="24"/>
-          <w:szCs w:val="24"/>
-        </w:rPr>
-        <w:fldChar w:fldCharType="separate"/>
-      </w:r>
-      <w:r>
-        <w:rPr>
-          <w:bCs/>
-          <w:noProof/>
-          <w:sz w:val="24"/>
-          <w:szCs w:val="24"/>
-        </w:rPr>
-        <w:t>«#if($StringUtils.isNotBlank($commentaire»</w:t>
-      </w:r>
-      <w:r>
-        <w:rPr>
-          <w:bCs/>
-          <w:sz w:val="24"/>
-          <w:szCs w:val="24"/>
-        </w:rPr>
-        <w:fldChar w:fldCharType="end"/>
-      </w:r>
-    </w:p>
-    <w:p>
-      <w:pPr>
-        <w:tabs>
-          <w:tab w:val="left" w:pos="1764"/>
-        </w:tabs>
-        <w:ind w:right="1134"/>
-        <w:jc w:val="both"/>
-        <w:rPr>
-          <w:bCs/>
-          <w:sz w:val="24"/>
-          <w:szCs w:val="24"/>
-        </w:rPr>
-      </w:pPr>
-    </w:p>
-    <w:p>
-      <w:pPr>
-        <w:tabs>
-          <w:tab w:val="left" w:pos="1764"/>
-        </w:tabs>
-        <w:ind w:left="1418" w:right="1134"/>
-        <w:jc w:val="both"/>
-        <w:rPr>
-          <w:bCs/>
-          <w:sz w:val="24"/>
-          <w:szCs w:val="24"/>
-        </w:rPr>
-      </w:pPr>
-      <w:r>
-        <w:rPr>
-          <w:bCs/>
-          <w:sz w:val="24"/>
-          <w:szCs w:val="24"/>
-        </w:rPr>
-        <w:fldChar w:fldCharType="begin"/>
-      </w:r>
-      <w:r>
-        <w:rPr>
-          <w:bCs/>
-          <w:sz w:val="24"/>
-          <w:szCs w:val="24"/>
-        </w:rPr>
-        <w:instrText xml:space="preserve"> MERGEFIELD  $commentaire  \* MERGEFORMAT </w:instrText>
-      </w:r>
-      <w:r>
-        <w:rPr>
-          <w:bCs/>
-          <w:sz w:val="24"/>
-          <w:szCs w:val="24"/>
-        </w:rPr>
-        <w:fldChar w:fldCharType="separate"/>
-      </w:r>
-      <w:r>
-        <w:rPr>
-          <w:bCs/>
-          <w:noProof/>
-          <w:sz w:val="24"/>
-          <w:szCs w:val="24"/>
-        </w:rPr>
-        <w:t>«$commentaire»</w:t>
-      </w:r>
-      <w:r>
-        <w:rPr>
-          <w:bCs/>
-          <w:sz w:val="24"/>
-          <w:szCs w:val="24"/>
-        </w:rPr>
-        <w:fldChar w:fldCharType="end"/>
-      </w:r>
-      <w:r>
-        <w:rPr>
-          <w:bCs/>
-          <w:sz w:val="24"/>
-          <w:szCs w:val="24"/>
-        </w:rPr>
-        <w:fldChar w:fldCharType="begin"/>
-      </w:r>
-      <w:r>
-        <w:rPr>
-          <w:bCs/>
-          <w:sz w:val="24"/>
-          <w:szCs w:val="24"/>
-        </w:rPr>
-        <w:instrText xml:space="preserve"> MERGEFIELD  #end  \* MERGEFORMAT </w:instrText>
-      </w:r>
-      <w:r>
-        <w:rPr>
-          <w:bCs/>
-          <w:sz w:val="24"/>
-          <w:szCs w:val="24"/>
-        </w:rPr>
-        <w:fldChar w:fldCharType="separate"/>
-      </w:r>
-      <w:r>
-        <w:rPr>
-          <w:bCs/>
-          <w:noProof/>
-          <w:sz w:val="24"/>
-          <w:szCs w:val="24"/>
-        </w:rPr>
-        <w:t>«#end»</w:t>
-      </w:r>
-      <w:r>
-        <w:rPr>
-          <w:bCs/>
-          <w:sz w:val="24"/>
-          <w:szCs w:val="24"/>
-        </w:rPr>
-        <w:fldChar w:fldCharType="end"/>
-      </w:r>
-    </w:p>
-    <w:p>
-      <w:pPr>
-        <w:pStyle w:val="Retraitcorpsdetexte2"/>
-        <w:tabs>
-          <w:tab w:val="left" w:pos="1764"/>
-          <w:tab w:val="left" w:pos="2268"/>
-        </w:tabs>
-        <w:ind w:left="1418" w:right="1134" w:firstLine="0"/>
-        <w:rPr>
-          <w:rFonts w:ascii="Times New Roman" w:hAnsi="Times New Roman"/>
-        </w:rPr>
-      </w:pPr>
-    </w:p>
-    <w:p>
-      <w:pPr>
-        <w:pStyle w:val="Normalcentr"/>
-        <w:tabs>
-          <w:tab w:val="left" w:pos="1764"/>
-        </w:tabs>
-        <w:ind w:left="1418" w:firstLine="0"/>
-      </w:pPr>
-      <w:r>
-        <w:t>Je</w:t>
-      </w:r>
-      <w:r>
-        <w:t xml:space="preserve"> vous prie d’agréer, </w:t>
-      </w:r>
-      <w:r>
-        <w:t>Messieurs,</w:t>
-      </w:r>
-      <w:r>
-        <w:t xml:space="preserve"> l’expression de mes salutations distinguées.</w:t>
-      </w:r>
-    </w:p>
-    <w:p>
-      <w:pPr>
-        <w:pStyle w:val="Normalcentr"/>
-        <w:tabs>
-          <w:tab w:val="left" w:pos="1764"/>
-        </w:tabs>
-        <w:ind w:left="1418" w:firstLine="0"/>
-      </w:pPr>
-      <w:r>
-        <w:t>_</w:t>
-      </w:r>
-      <w:r>
-        <w:t>R</w:t>
-      </w:r>
-      <w:r>
-        <w:t>APPELLE</w:t>
-      </w:r>
-      <w:r>
-        <w:t>_</w:t>
-      </w:r>
     </w:p>
     <w:p>
       <w:pPr>
@@ -1496,6 +1496,7 @@
         <w:noProof/>
         <w:sz w:val="24"/>
         <w:szCs w:val="24"/>
+        <w:lang w:eastAsia="ja-JP"/>
       </w:rPr>
       <w:drawing>
         <wp:inline distT="0" distB="0" distL="0" distR="0" wp14:anchorId="1B14505E" wp14:editId="755BF86B">
@@ -1587,6 +1588,7 @@
         <w:noProof/>
         <w:sz w:val="24"/>
         <w:szCs w:val="24"/>
+        <w:lang w:eastAsia="ja-JP"/>
       </w:rPr>
       <w:drawing>
         <wp:inline distT="0" distB="0" distL="0" distR="0" wp14:anchorId="7527657E" wp14:editId="036D81AC">
@@ -2672,7 +2674,7 @@
 </file>
 
 <file path=customXml/itemProps1.xml><?xml version="1.0" encoding="utf-8"?>
-<ds:datastoreItem xmlns:ds="http://schemas.openxmlformats.org/officeDocument/2006/customXml" ds:itemID="{0EC46595-C92E-4D6B-8565-A5F5FE33E50E}">
+<ds:datastoreItem xmlns:ds="http://schemas.openxmlformats.org/officeDocument/2006/customXml" ds:itemID="{B095C059-BC16-440D-BD88-87458A02C66D}">
   <ds:schemaRefs>
     <ds:schemaRef ds:uri="http://schemas.openxmlformats.org/officeDocument/2006/bibliography"/>
   </ds:schemaRefs>

</xml_diff>

<commit_message>
refs 12406 : merge avec la branche mailunittest-12407
git-svn-id: http://linuxic/jsrc/af/branches/v4.1.0@50026 f0974e12-e15a-48e7-82bd-60f10596da88
</commit_message>
<xml_diff>
--- a/af-back/src/test/resources/pdf/DemandeAccepteeTest.docx
+++ b/af-back/src/test/resources/pdf/DemandeAccepteeTest.docx
@@ -93,7 +93,17 @@
           <w:sz w:val="24"/>
           <w:szCs w:val="24"/>
         </w:rPr>
-        <w:t>«$raisonSociale»</w:t>
+        <w:t>«$rais</w:t>
+      </w:r>
+      <w:bookmarkStart w:id="0" w:name="_GoBack"/>
+      <w:bookmarkEnd w:id="0"/>
+      <w:r>
+        <w:rPr>
+          <w:noProof/>
+          <w:sz w:val="24"/>
+          <w:szCs w:val="24"/>
+        </w:rPr>
+        <w:t>onSociale»</w:t>
       </w:r>
       <w:r>
         <w:rPr>
@@ -1235,8 +1245,6 @@
       <w:r>
         <w:t>_</w:t>
       </w:r>
-      <w:bookmarkStart w:id="0" w:name="_GoBack"/>
-      <w:bookmarkEnd w:id="0"/>
     </w:p>
     <w:p>
       <w:pPr>
@@ -1496,7 +1504,6 @@
         <w:noProof/>
         <w:sz w:val="24"/>
         <w:szCs w:val="24"/>
-        <w:lang w:eastAsia="ja-JP"/>
       </w:rPr>
       <w:drawing>
         <wp:inline distT="0" distB="0" distL="0" distR="0" wp14:anchorId="1B14505E" wp14:editId="755BF86B">
@@ -1588,7 +1595,6 @@
         <w:noProof/>
         <w:sz w:val="24"/>
         <w:szCs w:val="24"/>
-        <w:lang w:eastAsia="ja-JP"/>
       </w:rPr>
       <w:drawing>
         <wp:inline distT="0" distB="0" distL="0" distR="0" wp14:anchorId="7527657E" wp14:editId="036D81AC">
@@ -2674,7 +2680,7 @@
 </file>
 
 <file path=customXml/itemProps1.xml><?xml version="1.0" encoding="utf-8"?>
-<ds:datastoreItem xmlns:ds="http://schemas.openxmlformats.org/officeDocument/2006/customXml" ds:itemID="{B095C059-BC16-440D-BD88-87458A02C66D}">
+<ds:datastoreItem xmlns:ds="http://schemas.openxmlformats.org/officeDocument/2006/customXml" ds:itemID="{1166EBAC-F8C9-4790-8D63-7C32C9716344}">
   <ds:schemaRefs>
     <ds:schemaRef ds:uri="http://schemas.openxmlformats.org/officeDocument/2006/bibliography"/>
   </ds:schemaRefs>

</xml_diff>